<commit_message>
refactor: align all 4 charts with case study value logic chain
Charts now trace the Netflix recommendation engine value chain:
  Better Predictions → Higher Engagement → Lower Churn → Revenue Growth

1. Engagement Trend (line) — completion rate + session time over time
   Shows seasonal patterns, platform growth. ML target P(completion).
2. Churn by Plan (bar) — Basic 14% vs Premium+ 3%
   Color-coded risk. Answers "where are we losing users?"
3. Session Duration by Device (bar) — Smart TV 2.57hrs vs Mobile 0.85hrs
   Answers "where to invest in UX?"
4. Rec CTR by Algorithm (bar) — Personalized 37% vs Similar Users 13%
   Directly answers case study Q1.

Removed: genre bar (not actionable), device donut (flat distribution)
Updated: Word report with new chart descriptions

Co-Authored-By: Claude Opus 4.6 (1M context) <noreply@anthropic.com>
</commit_message>
<xml_diff>
--- a/Lepin_Novikov.docx
+++ b/Lepin_Novikov.docx
@@ -1122,7 +1122,7 @@
         <w:pStyle w:val="ListBullet"/>
       </w:pPr>
       <w:r>
-        <w:t>Chart 1 — Weekly Watch Hours by Subscription Plan (Line Chart): Shows engagement trends over the 24-month period, segmented by subscription tier. Reveals seasonal patterns (holiday spikes in Dec/Jan) and the platform growth trend.</w:t>
+        <w:t>Chart 1 — Monthly Engagement Trend (Dual-axis Line Chart): Tracks completion rate (%) and average session time (hrs) over the 24-month period. Reveals seasonal patterns: holiday spikes in Dec/Jan, summer boost in Jul/Aug, and Feb dip. Completion rate is the key ML target P(completion) from the recommendation engine case study. Answers: 'Is engagement improving over time?'</w:t>
       </w:r>
     </w:p>
     <w:p>
@@ -1130,7 +1130,7 @@
         <w:pStyle w:val="ListBullet"/>
       </w:pPr>
       <w:r>
-        <w:t>Chart 2 — Top 10 Genres by Watch Time (Horizontal Bar Chart): Ranks content genres by total viewing hours. Sci-Fi leads with 11,836 hours, followed by Adventure (11,517) and Animation (10,266). Actionable for content acquisition decisions.</w:t>
+        <w:t>Chart 2 — Churn Rate by Subscription Plan (Vertical Bar Chart): Shows churn risk across subscription tiers. Basic plan shows 13.6% churn (red — critical), while Premium+ shows only 3.0% (green — healthy). Color-coded bars make risk levels immediately visible. Answers: 'Which segments are we losing? Where to invest in retention?'</w:t>
       </w:r>
     </w:p>
     <w:p>
@@ -1138,7 +1138,7 @@
         <w:pStyle w:val="ListBullet"/>
       </w:pPr>
       <w:r>
-        <w:t>Chart 3 — Watch Sessions by Device (Donut Chart): Displays device distribution. Sessions are roughly equal across devices but Smart TV users watch significantly longer per session (1.69 hrs vs Mobile 0.82 hrs).</w:t>
+        <w:t>Chart 3 — Avg Session Duration by Device (Horizontal Bar Chart): Compares average viewing session length across devices. Smart TV leads at 2.57 hrs (green) while Mobile is shortest at 0.85 hrs (red). Answers: 'Where is engagement strongest? Which platform UX needs investment?'</w:t>
       </w:r>
     </w:p>
     <w:p>
@@ -1146,7 +1146,7 @@
         <w:pStyle w:val="ListBullet"/>
       </w:pPr>
       <w:r>
-        <w:t>Chart 4 — Recommendation CTR by Algorithm Type (Horizontal Bar Chart): Compares click-through rates across recommendation strategies. Personalized recommendations lead at 36.6%, followed by Genre-Based (28.0%), Trending (22.1%), New Releases (17.1%), and Similar Users (12.7%). Directly supports the Netflix recommendation engine optimization case study.</w:t>
+        <w:t>Chart 4 — Recommendation CTR by Algorithm Type (Horizontal Bar Chart): Compares click-through rates across recommendation strategies. Personalized recommendations lead at 36.6% (green), followed by Genre-Based (28.0%), Trending (22.1%), New Releases (17.1%), and Similar Users (12.7%). Directly ties to the case study: 'Which algorithm produces the best predictions?'</w:t>
       </w:r>
     </w:p>
     <w:p>

</xml_diff>

<commit_message>
fix: datetime compatibility + complete report with enrichment methodology
1. Fix AttributeError on Streamlit Cloud (Python 3.14):
   - charts.py: explicit pd.to_datetime() + numpy datetime64[M]
     instead of .dt.to_period() which fails on non-datetime columns
   - Added .python-version file for 3.12

2. Report now has 7 sections matching assignment requirements:
   - Business requirements, data prep, screenshot, link, dashboard
     + alarm description, data enrichment methodology, peer review
   - Updated KPI figures to match actual enriched data
   - Updated key questions to match actual charts
   - Added Section 6: Data Enrichment Methodology with before/after
     comparison table and reference to data_enrichment_prompt.md

3. Enrichment prompt (data_enrichment_prompt.md) referenced in report

Co-Authored-By: Claude Opus 4.6 (1M context) <noreply@anthropic.com>
</commit_message>
<xml_diff>
--- a/Lepin_Novikov.docx
+++ b/Lepin_Novikov.docx
@@ -115,7 +115,7 @@
         <w:pStyle w:val="ListBullet"/>
       </w:pPr>
       <w:r>
-        <w:t>Which content genres and types (Movies, TV Series, Documentaries) drive the highest engagement?</w:t>
+        <w:t>Is user engagement (completion rate, session time) improving over time? Are there seasonal patterns to account for?</w:t>
       </w:r>
     </w:p>
     <w:p>
@@ -123,7 +123,7 @@
         <w:pStyle w:val="ListBullet"/>
       </w:pPr>
       <w:r>
-        <w:t>How effective are different recommendation types (personalized vs trending vs genre-based) at driving clicks?</w:t>
+        <w:t>How effective are different recommendation algorithms (personalized vs trending vs genre-based) at driving clicks?</w:t>
       </w:r>
     </w:p>
     <w:p>
@@ -139,7 +139,7 @@
         <w:pStyle w:val="ListBullet"/>
       </w:pPr>
       <w:r>
-        <w:t>How do viewing patterns differ across devices (Smart TV vs Mobile vs Desktop)?</w:t>
+        <w:t>How do viewing engagement patterns differ across devices (Smart TV vs Mobile vs Desktop)?</w:t>
       </w:r>
     </w:p>
     <w:p>
@@ -199,7 +199,7 @@
         <w:pStyle w:val="ListBullet"/>
       </w:pPr>
       <w:r>
-        <w:t>Churn correlation with subscription tier: Basic ~29%, Standard ~17%, Premium ~10%, Premium+ ~6% (higher-value plans retain better)</w:t>
+        <w:t>Churn correlation with subscription tier: Basic ~14%, Standard ~7%, Premium ~4%, Premium+ ~3% — reflecting that higher-value plans retain better</w:t>
       </w:r>
     </w:p>
     <w:p>
@@ -207,7 +207,7 @@
         <w:pStyle w:val="ListBullet"/>
       </w:pPr>
       <w:r>
-        <w:t>Device-based viewing patterns: Smart TV sessions 1.69 hrs avg vs Mobile 0.82 hrs (big screen = longer sessions)</w:t>
+        <w:t>Device-based viewing patterns: Smart TV sessions 2.57 hrs avg vs Mobile 0.85 hrs — big screen enables lean-back, longer sessions</w:t>
       </w:r>
     </w:p>
     <w:p>
@@ -215,7 +215,7 @@
         <w:pStyle w:val="ListBullet"/>
       </w:pPr>
       <w:r>
-        <w:t>Seasonal engagement spikes: December/January +30% (holidays), July/August +15% (summer binge), February -10%</w:t>
+        <w:t>Seasonal engagement spikes: December/January +30-50% (holiday binge), July/August +5-25% (summer), February -10-25% (post-holiday dip)</w:t>
       </w:r>
     </w:p>
     <w:p>
@@ -223,7 +223,7 @@
         <w:pStyle w:val="ListBullet"/>
       </w:pPr>
       <w:r>
-        <w:t>Recommendation effectiveness by type: Personalized 29.6% CTR vs Similar Users 13.6% CTR (better algorithms = better results)</w:t>
+        <w:t>Recommendation effectiveness by type: Personalized ~37% CTR vs Similar Users ~13% CTR — better algorithms produce better results</w:t>
       </w:r>
     </w:p>
     <w:p>
@@ -231,7 +231,7 @@
         <w:pStyle w:val="ListBullet"/>
       </w:pPr>
       <w:r>
-        <w:t>Platform growth trend: +20% engagement growth over the 24-month period</w:t>
+        <w:t>Platform growth trend: +25% engagement growth over the 24-month period, simulating a maturing platform with improving content catalog</w:t>
       </w:r>
     </w:p>
     <w:p>
@@ -239,7 +239,7 @@
         <w:pStyle w:val="ListBullet"/>
       </w:pPr>
       <w:r>
-        <w:t>Subscription tier engagement: Premium/Premium+ users watch 25% more, Basic users watch 25% less</w:t>
+        <w:t>Subscription tier engagement: Premium/Premium+ users watch 30% more per session, Basic users watch 30% less — reflecting plan value correlation</w:t>
       </w:r>
     </w:p>
     <w:p>
@@ -247,7 +247,15 @@
         <w:pStyle w:val="ListBullet"/>
       </w:pPr>
       <w:r>
-        <w:t>Content type completion rates: Movies have higher completion rates than documentaries</w:t>
+        <w:t>Content type completion rates: Movies ~70% completion vs Documentaries ~12% — different content formats have different consumption patterns</w:t>
+      </w:r>
+    </w:p>
+    <w:p>
+      <w:pPr>
+        <w:pStyle w:val="ListBullet"/>
+      </w:pPr>
+      <w:r>
+        <w:t>Genre engagement: Thriller/Sci-Fi/Drama have 25% higher session time vs Documentary/Sport/History — reflecting audience engagement differences</w:t>
       </w:r>
     </w:p>
     <w:p>
@@ -1480,7 +1488,422 @@
         <w:pStyle w:val="Heading1"/>
       </w:pPr>
       <w:r>
-        <w:t>6. Peer Review</w:t>
+        <w:t>6. Data Enrichment Methodology</w:t>
+      </w:r>
+    </w:p>
+    <w:p>
+      <w:r>
+        <w:t>The original Kaggle dataset had uniformly random distributions across all dimensions, making it impossible to derive actionable insights. We developed a structured AI-assisted enrichment approach to inject realistic streaming platform dynamics while preserving the original schema and row counts.</w:t>
+      </w:r>
+    </w:p>
+    <w:p>
+      <w:pPr>
+        <w:pStyle w:val="Heading2"/>
+      </w:pPr>
+      <w:r>
+        <w:t>Enrichment Process</w:t>
+      </w:r>
+    </w:p>
+    <w:p>
+      <w:pPr>
+        <w:pStyle w:val="ListBullet"/>
+      </w:pPr>
+      <w:r>
+        <w:t>Step 1 — Exploratory analysis of the original Kaggle data confirmed flat distributions: all KPIs were identical across segments (~15% churn for all plans, ~1.1 hrs watch time for all devices, ~15% CTR for all recommendation types).</w:t>
+      </w:r>
+    </w:p>
+    <w:p>
+      <w:pPr>
+        <w:pStyle w:val="ListBullet"/>
+      </w:pPr>
+      <w:r>
+        <w:t>Step 2 — We designed a detailed enrichment prompt (data_enrichment_prompt.md, included in the repository) specifying realistic business patterns based on industry knowledge about streaming platforms.</w:t>
+      </w:r>
+    </w:p>
+    <w:p>
+      <w:pPr>
+        <w:pStyle w:val="ListBullet"/>
+      </w:pPr>
+      <w:r>
+        <w:t>Step 3 — The enrichment script (fix_data.py) was generated from the prompt and applied multiplicative transformations to 3 of the 6 tables: users.csv (churn patterns), watch_history.csv (viewing patterns), and recommendation_logs.csv (algorithm effectiveness).</w:t>
+      </w:r>
+    </w:p>
+    <w:p>
+      <w:pPr>
+        <w:pStyle w:val="ListBullet"/>
+      </w:pPr>
+      <w:r>
+        <w:t>Step 4 — Validation confirmed that enriched data produces meaningful variance across segments while maintaining the original schema, row counts, and data types.</w:t>
+      </w:r>
+    </w:p>
+    <w:p>
+      <w:pPr>
+        <w:pStyle w:val="Heading2"/>
+      </w:pPr>
+      <w:r>
+        <w:t>Enrichment Prompt Summary</w:t>
+      </w:r>
+    </w:p>
+    <w:p>
+      <w:r>
+        <w:t>The full enrichment prompt is available in the repository as data_enrichment_prompt.md. Key design principles:</w:t>
+      </w:r>
+    </w:p>
+    <w:p>
+      <w:pPr>
+        <w:pStyle w:val="ListBullet"/>
+      </w:pPr>
+      <w:r>
+        <w:t>All transformations are multiplicative — they shift means while preserving distribution shapes, rather than replacing values entirely</w:t>
+      </w:r>
+    </w:p>
+    <w:p>
+      <w:pPr>
+        <w:pStyle w:val="ListBullet"/>
+      </w:pPr>
+      <w:r>
+        <w:t>Patterns are based on documented streaming industry dynamics: position bias in recommendations, device-based session length differences, seasonal viewing patterns, and subscription tier retention curves</w:t>
+      </w:r>
+    </w:p>
+    <w:p>
+      <w:pPr>
+        <w:pStyle w:val="ListBullet"/>
+      </w:pPr>
+      <w:r>
+        <w:t>Random seed (42) ensures reproducibility — running fix_data.py on the original Kaggle data produces identical results</w:t>
+      </w:r>
+    </w:p>
+    <w:p>
+      <w:pPr>
+        <w:pStyle w:val="ListBullet"/>
+      </w:pPr>
+      <w:r>
+        <w:t>3 tables modified (users, watch_history, recommendation_logs), 3 tables untouched (movies, search_logs, reviews) — only tables relevant to dashboard KPIs were enriched</w:t>
+      </w:r>
+    </w:p>
+    <w:p>
+      <w:pPr>
+        <w:pStyle w:val="Heading2"/>
+      </w:pPr>
+      <w:r>
+        <w:t>Before vs After Enrichment</w:t>
+      </w:r>
+    </w:p>
+    <w:tbl>
+      <w:tblPr>
+        <w:tblStyle w:val="LightGrid-Accent1"/>
+        <w:tblW w:type="auto" w:w="0"/>
+        <w:tblLook w:firstColumn="1" w:firstRow="1" w:lastColumn="0" w:lastRow="0" w:noHBand="0" w:noVBand="1" w:val="04A0"/>
+      </w:tblPr>
+      <w:tblGrid>
+        <w:gridCol w:w="2880"/>
+        <w:gridCol w:w="2880"/>
+        <w:gridCol w:w="2880"/>
+      </w:tblGrid>
+      <w:tr>
+        <w:tc>
+          <w:tcPr>
+            <w:tcW w:type="dxa" w:w="2880"/>
+          </w:tcPr>
+          <w:p>
+            <w:r>
+              <w:rPr>
+                <w:b/>
+              </w:rPr>
+              <w:t>Metric</w:t>
+            </w:r>
+          </w:p>
+        </w:tc>
+        <w:tc>
+          <w:tcPr>
+            <w:tcW w:type="dxa" w:w="2880"/>
+          </w:tcPr>
+          <w:p>
+            <w:r>
+              <w:rPr>
+                <w:b/>
+              </w:rPr>
+              <w:t>Before (Kaggle Original)</w:t>
+            </w:r>
+          </w:p>
+        </w:tc>
+        <w:tc>
+          <w:tcPr>
+            <w:tcW w:type="dxa" w:w="2880"/>
+          </w:tcPr>
+          <w:p>
+            <w:r>
+              <w:rPr>
+                <w:b/>
+              </w:rPr>
+              <w:t>After (Enriched)</w:t>
+            </w:r>
+          </w:p>
+        </w:tc>
+      </w:tr>
+      <w:tr>
+        <w:tc>
+          <w:tcPr>
+            <w:tcW w:type="dxa" w:w="2880"/>
+          </w:tcPr>
+          <w:p>
+            <w:r>
+              <w:t>Churn Rate (Basic)</w:t>
+            </w:r>
+          </w:p>
+        </w:tc>
+        <w:tc>
+          <w:tcPr>
+            <w:tcW w:type="dxa" w:w="2880"/>
+          </w:tcPr>
+          <w:p>
+            <w:r>
+              <w:t>~15%</w:t>
+            </w:r>
+          </w:p>
+        </w:tc>
+        <w:tc>
+          <w:tcPr>
+            <w:tcW w:type="dxa" w:w="2880"/>
+          </w:tcPr>
+          <w:p>
+            <w:r>
+              <w:t>13.6%</w:t>
+            </w:r>
+          </w:p>
+        </w:tc>
+      </w:tr>
+      <w:tr>
+        <w:tc>
+          <w:tcPr>
+            <w:tcW w:type="dxa" w:w="2880"/>
+          </w:tcPr>
+          <w:p>
+            <w:r>
+              <w:t>Churn Rate (Premium+)</w:t>
+            </w:r>
+          </w:p>
+        </w:tc>
+        <w:tc>
+          <w:tcPr>
+            <w:tcW w:type="dxa" w:w="2880"/>
+          </w:tcPr>
+          <w:p>
+            <w:r>
+              <w:t>~15%</w:t>
+            </w:r>
+          </w:p>
+        </w:tc>
+        <w:tc>
+          <w:tcPr>
+            <w:tcW w:type="dxa" w:w="2880"/>
+          </w:tcPr>
+          <w:p>
+            <w:r>
+              <w:t>3.0%</w:t>
+            </w:r>
+          </w:p>
+        </w:tc>
+      </w:tr>
+      <w:tr>
+        <w:tc>
+          <w:tcPr>
+            <w:tcW w:type="dxa" w:w="2880"/>
+          </w:tcPr>
+          <w:p>
+            <w:r>
+              <w:t>Avg Session (Smart TV)</w:t>
+            </w:r>
+          </w:p>
+        </w:tc>
+        <w:tc>
+          <w:tcPr>
+            <w:tcW w:type="dxa" w:w="2880"/>
+          </w:tcPr>
+          <w:p>
+            <w:r>
+              <w:t>1.1 hrs</w:t>
+            </w:r>
+          </w:p>
+        </w:tc>
+        <w:tc>
+          <w:tcPr>
+            <w:tcW w:type="dxa" w:w="2880"/>
+          </w:tcPr>
+          <w:p>
+            <w:r>
+              <w:t>2.57 hrs</w:t>
+            </w:r>
+          </w:p>
+        </w:tc>
+      </w:tr>
+      <w:tr>
+        <w:tc>
+          <w:tcPr>
+            <w:tcW w:type="dxa" w:w="2880"/>
+          </w:tcPr>
+          <w:p>
+            <w:r>
+              <w:t>Avg Session (Mobile)</w:t>
+            </w:r>
+          </w:p>
+        </w:tc>
+        <w:tc>
+          <w:tcPr>
+            <w:tcW w:type="dxa" w:w="2880"/>
+          </w:tcPr>
+          <w:p>
+            <w:r>
+              <w:t>1.1 hrs</w:t>
+            </w:r>
+          </w:p>
+        </w:tc>
+        <w:tc>
+          <w:tcPr>
+            <w:tcW w:type="dxa" w:w="2880"/>
+          </w:tcPr>
+          <w:p>
+            <w:r>
+              <w:t>0.85 hrs</w:t>
+            </w:r>
+          </w:p>
+        </w:tc>
+      </w:tr>
+      <w:tr>
+        <w:tc>
+          <w:tcPr>
+            <w:tcW w:type="dxa" w:w="2880"/>
+          </w:tcPr>
+          <w:p>
+            <w:r>
+              <w:t>Rec CTR (Personalized)</w:t>
+            </w:r>
+          </w:p>
+        </w:tc>
+        <w:tc>
+          <w:tcPr>
+            <w:tcW w:type="dxa" w:w="2880"/>
+          </w:tcPr>
+          <w:p>
+            <w:r>
+              <w:t>~15%</w:t>
+            </w:r>
+          </w:p>
+        </w:tc>
+        <w:tc>
+          <w:tcPr>
+            <w:tcW w:type="dxa" w:w="2880"/>
+          </w:tcPr>
+          <w:p>
+            <w:r>
+              <w:t>36.6%</w:t>
+            </w:r>
+          </w:p>
+        </w:tc>
+      </w:tr>
+      <w:tr>
+        <w:tc>
+          <w:tcPr>
+            <w:tcW w:type="dxa" w:w="2880"/>
+          </w:tcPr>
+          <w:p>
+            <w:r>
+              <w:t>Rec CTR (Similar Users)</w:t>
+            </w:r>
+          </w:p>
+        </w:tc>
+        <w:tc>
+          <w:tcPr>
+            <w:tcW w:type="dxa" w:w="2880"/>
+          </w:tcPr>
+          <w:p>
+            <w:r>
+              <w:t>~15%</w:t>
+            </w:r>
+          </w:p>
+        </w:tc>
+        <w:tc>
+          <w:tcPr>
+            <w:tcW w:type="dxa" w:w="2880"/>
+          </w:tcPr>
+          <w:p>
+            <w:r>
+              <w:t>12.7%</w:t>
+            </w:r>
+          </w:p>
+        </w:tc>
+      </w:tr>
+      <w:tr>
+        <w:tc>
+          <w:tcPr>
+            <w:tcW w:type="dxa" w:w="2880"/>
+          </w:tcPr>
+          <w:p>
+            <w:r>
+              <w:t>Completion (Movie)</w:t>
+            </w:r>
+          </w:p>
+        </w:tc>
+        <w:tc>
+          <w:tcPr>
+            <w:tcW w:type="dxa" w:w="2880"/>
+          </w:tcPr>
+          <w:p>
+            <w:r>
+              <w:t>~10%</w:t>
+            </w:r>
+          </w:p>
+        </w:tc>
+        <w:tc>
+          <w:tcPr>
+            <w:tcW w:type="dxa" w:w="2880"/>
+          </w:tcPr>
+          <w:p>
+            <w:r>
+              <w:t>70.5%</w:t>
+            </w:r>
+          </w:p>
+        </w:tc>
+      </w:tr>
+      <w:tr>
+        <w:tc>
+          <w:tcPr>
+            <w:tcW w:type="dxa" w:w="2880"/>
+          </w:tcPr>
+          <w:p>
+            <w:r>
+              <w:t>Completion (Documentary)</w:t>
+            </w:r>
+          </w:p>
+        </w:tc>
+        <w:tc>
+          <w:tcPr>
+            <w:tcW w:type="dxa" w:w="2880"/>
+          </w:tcPr>
+          <w:p>
+            <w:r>
+              <w:t>~10%</w:t>
+            </w:r>
+          </w:p>
+        </w:tc>
+        <w:tc>
+          <w:tcPr>
+            <w:tcW w:type="dxa" w:w="2880"/>
+          </w:tcPr>
+          <w:p>
+            <w:r>
+              <w:t>12.4%</w:t>
+            </w:r>
+          </w:p>
+        </w:tc>
+      </w:tr>
+    </w:tbl>
+    <w:p>
+      <w:pPr>
+        <w:pStyle w:val="Heading1"/>
+      </w:pPr>
+      <w:r>
+        <w:t>7. Peer Review</w:t>
       </w:r>
     </w:p>
     <w:p>

</xml_diff>

<commit_message>
feat: add 5th KPI + donut chart + peer review
Competitive improvements after reviewing peer submissions:
- Added 5th KPI: Active Users count (class avg was 5 KPIs)
- Added 5th chart: Completion Rate by Content Type (donut)
  Now 3 visualization types (line, bar, donut) vs 2 before
- KPI row expanded to 5 columns
- Bottom chart row expanded to 3 columns

Peer review:
- Reviewed Marko & Dimitrije's UMG Music dashboard (koyara.netlify.app)
- Detailed strengths/improvements analysis in report Section 7

Co-Authored-By: Claude Opus 4.6 (1M context) <noreply@anthropic.com>
</commit_message>
<xml_diff>
--- a/Lepin_Novikov.docx
+++ b/Lepin_Novikov.docx
@@ -1907,8 +1907,128 @@
       </w:r>
     </w:p>
     <w:p>
+      <w:pPr>
+        <w:pStyle w:val="Heading2"/>
+      </w:pPr>
       <w:r>
-        <w:t>[This section is for reviewing another team's dashboard. Fill in using the provided peer review template.]</w:t>
+        <w:t>Dashboard Reviewed</w:t>
+      </w:r>
+    </w:p>
+    <w:p>
+      <w:r>
+        <w:t>Team: Marko Kolarevic, Dimitrije Dragicevic</w:t>
+        <w:br/>
+        <w:t>Dashboard: Global Music Performance &amp; Genre Trends (Universal Music Group)</w:t>
+        <w:br/>
+        <w:t>Link: https://koyara.netlify.app/</w:t>
+        <w:br/>
+        <w:t>Tool: Custom web application (Netlify deployment)</w:t>
+      </w:r>
+    </w:p>
+    <w:p>
+      <w:pPr>
+        <w:pStyle w:val="Heading2"/>
+      </w:pPr>
+      <w:r>
+        <w:t>Overall Impression</w:t>
+      </w:r>
+    </w:p>
+    <w:p>
+      <w:r>
+        <w:t>A well-designed strategic dashboard that effectively monitors the global music industry performance for Universal Music Group. The dashboard presents a clear business narrative: tracking revenue across genres, regions, and release types (singles vs albums) to inform content investment decisions.</w:t>
+      </w:r>
+    </w:p>
+    <w:p>
+      <w:pPr>
+        <w:pStyle w:val="Heading2"/>
+      </w:pPr>
+      <w:r>
+        <w:t>Strengths</w:t>
+      </w:r>
+    </w:p>
+    <w:p>
+      <w:pPr>
+        <w:pStyle w:val="ListBullet"/>
+      </w:pPr>
+      <w:r>
+        <w:t>Professional visual design with consistent typography, organized grid layout, and a sophisticated color palette (gold accents, dark headers) that feels appropriate for a premium entertainment brand.</w:t>
+      </w:r>
+    </w:p>
+    <w:p>
+      <w:pPr>
+        <w:pStyle w:val="ListBullet"/>
+      </w:pPr>
+      <w:r>
+        <w:t>Good variety of visualization types: line chart (genre trends over time), doughnut chart (market share), horizontal bar (regional revenue), stacked bar (single vs album by genre), and data table (top releases). This diversity makes the dashboard informative and visually engaging.</w:t>
+      </w:r>
+    </w:p>
+    <w:p>
+      <w:pPr>
+        <w:pStyle w:val="ListBullet"/>
+      </w:pPr>
+      <w:r>
+        <w:t>5 well-chosen KPIs (Total Revenue, YoY Growth, Top Genre, Top Region, Single:Album Ratio) that directly support strategic decision-making.</w:t>
+      </w:r>
+    </w:p>
+    <w:p>
+      <w:pPr>
+        <w:pStyle w:val="ListBullet"/>
+      </w:pPr>
+      <w:r>
+        <w:t>Comprehensive filter system (year, genre, region, release type, release name search) with 5 controls that enable deep drill-down analysis.</w:t>
+      </w:r>
+    </w:p>
+    <w:p>
+      <w:pPr>
+        <w:pStyle w:val="ListBullet"/>
+      </w:pPr>
+      <w:r>
+        <w:t>Alarm/alert triggers are thoughtfully designed: YoY growth below 0%, regional drops exceeding 20%, genre share below 5%. These are actionable thresholds tied to real business decisions.</w:t>
+      </w:r>
+    </w:p>
+    <w:p>
+      <w:pPr>
+        <w:pStyle w:val="Heading2"/>
+      </w:pPr>
+      <w:r>
+        <w:t>Areas for Improvement</w:t>
+      </w:r>
+    </w:p>
+    <w:p>
+      <w:pPr>
+        <w:pStyle w:val="ListBullet"/>
+      </w:pPr>
+      <w:r>
+        <w:t>The dashboard could benefit from a time period filter (date range picker) in addition to the year dropdown, allowing analysis of specific quarters or months within a year for more granular seasonal insights.</w:t>
+      </w:r>
+    </w:p>
+    <w:p>
+      <w:pPr>
+        <w:pStyle w:val="ListBullet"/>
+      </w:pPr>
+      <w:r>
+        <w:t>The Top Releases table, while informative, takes significant screen space. Consider making it collapsible or moving it to a secondary view to keep the main screen more focused on visual analytics.</w:t>
+      </w:r>
+    </w:p>
+    <w:p>
+      <w:pPr>
+        <w:pStyle w:val="ListBullet"/>
+      </w:pPr>
+      <w:r>
+        <w:t>Consider adding a trend indicator (up/down arrow with percentage) next to each KPI to show direction of change at a glance, similar to sparklines used in financial dashboards.</w:t>
+      </w:r>
+    </w:p>
+    <w:p>
+      <w:pPr>
+        <w:pStyle w:val="Heading2"/>
+      </w:pPr>
+      <w:r>
+        <w:t>Conclusion</w:t>
+      </w:r>
+    </w:p>
+    <w:p>
+      <w:r>
+        <w:t>Overall, this is a strong dashboard that demonstrates solid understanding of BI principles. The combination of clear business framing, appropriate visualization choices, and actionable alarm thresholds makes it a useful decision-making tool for music industry executives. The custom web deployment shows technical ambition beyond standard BI tools, and the result is polished and professional. Score: 8/10.</w:t>
       </w:r>
     </w:p>
     <w:sectPr>

</xml_diff>